<commit_message>
fixes to confirm to new flow
</commit_message>
<xml_diff>
--- a/VulnerabilityResolutionAIFoundry.docx
+++ b/VulnerabilityResolutionAIFoundry.docx
@@ -235,7 +235,7 @@
                 <w:b w:val="0"/>
                 <w:sz w:val="19"/>
               </w:rPr>
-              <w:t>1.0</w:t>
+              <w:t>1.1</w:t>
             </w:r>
           </w:p>
         </w:tc>
@@ -415,7 +415,7 @@
                 <w:b w:val="0"/>
                 <w:sz w:val="19"/>
               </w:rPr>
-              <w:t>PLAN.md (this repository)</w:t>
+              <w:t>PLAN.md and DEPLOYMENT_AAF.md (this repository)</w:t>
             </w:r>
           </w:p>
         </w:tc>
@@ -574,6 +574,76 @@
           <w:tcPr>
             <w:tcW w:type="dxa" w:w="1440"/>
             <w:shd w:val="clear" w:color="auto" w:fill="FFFFFF"/>
+          </w:tcPr>
+          <w:p>
+            <w:r/>
+            <w:r>
+              <w:rPr>
+                <w:rFonts w:ascii="Calibri" w:hAnsi="Calibri"/>
+                <w:b w:val="0"/>
+                <w:sz w:val="19"/>
+              </w:rPr>
+              <w:t>Neurealm Engineering</w:t>
+            </w:r>
+          </w:p>
+        </w:tc>
+      </w:tr>
+      <w:tr>
+        <w:tc>
+          <w:tcPr>
+            <w:tcW w:type="dxa" w:w="1152"/>
+            <w:shd w:val="clear" w:color="auto" w:fill="EEF2F7"/>
+          </w:tcPr>
+          <w:p>
+            <w:r/>
+            <w:r>
+              <w:rPr>
+                <w:rFonts w:ascii="Calibri" w:hAnsi="Calibri"/>
+                <w:b w:val="0"/>
+                <w:sz w:val="19"/>
+              </w:rPr>
+              <w:t>1.1</w:t>
+            </w:r>
+          </w:p>
+        </w:tc>
+        <w:tc>
+          <w:tcPr>
+            <w:tcW w:type="dxa" w:w="1584"/>
+            <w:shd w:val="clear" w:color="auto" w:fill="EEF2F7"/>
+          </w:tcPr>
+          <w:p>
+            <w:r/>
+            <w:r>
+              <w:rPr>
+                <w:rFonts w:ascii="Calibri" w:hAnsi="Calibri"/>
+                <w:b w:val="0"/>
+                <w:sz w:val="19"/>
+              </w:rPr>
+              <w:t>July 02, 2026</w:t>
+            </w:r>
+          </w:p>
+        </w:tc>
+        <w:tc>
+          <w:tcPr>
+            <w:tcW w:type="dxa" w:w="5184"/>
+            <w:shd w:val="clear" w:color="auto" w:fill="EEF2F7"/>
+          </w:tcPr>
+          <w:p>
+            <w:r/>
+            <w:r>
+              <w:rPr>
+                <w:rFonts w:ascii="Calibri" w:hAnsi="Calibri"/>
+                <w:b w:val="0"/>
+                <w:sz w:val="19"/>
+              </w:rPr>
+              <w:t>Added Azure Monitor telemetry (OBS-02, Section 5.7); corrected Knowledge Agent/Classifier container claims, infra secrets/env vars, and the KB-hit-fast-path / RetryGate test-coverage gaps (Section 11.5)</w:t>
+            </w:r>
+          </w:p>
+        </w:tc>
+        <w:tc>
+          <w:tcPr>
+            <w:tcW w:type="dxa" w:w="1440"/>
+            <w:shd w:val="clear" w:color="auto" w:fill="EEF2F7"/>
           </w:tcPr>
           <w:p>
             <w:r/>
@@ -2153,11 +2223,15 @@
         <w:br/>
       </w:r>
       <w:r>
-        <w:t>|-- README.md, PLAN.md</w:t>
+        <w:t>|-- README.md, PLAN.md, DEPLOYMENT_AAF.md, TESTING_DOCKER.md, TESTING_PODMAN.md</w:t>
         <w:br/>
       </w:r>
       <w:r>
-        <w:t>|-- streamlit_dashboard.py        observability dashboard (Section 5.6)</w:t>
+        <w:t>|-- streamlit_dashboard.py        local observability dashboard (Section 5.6)</w:t>
+        <w:br/>
+      </w:r>
+      <w:r>
+        <w:t>|-- config.yaml.example           deploy-time config; cp to config.yaml (gitignored)</w:t>
         <w:br/>
       </w:r>
       <w:r>
@@ -2165,7 +2239,15 @@
         <w:br/>
       </w:r>
       <w:r>
-        <w:t>|   |-- main.bicep                ACR, Key Vault, Cosmos DB (Serverless)</w:t>
+        <w:t>|   |-- main.bicep                ACR, Key Vault, Cosmos DB (Serverless),</w:t>
+        <w:br/>
+      </w:r>
+      <w:r>
+        <w:t>|   |                             Log Analytics + App Insights + Workbook (OBS-02)</w:t>
+        <w:br/>
+      </w:r>
+      <w:r>
+        <w:t>|   |-- observability/            remediation-workbook.json, queries.kql</w:t>
         <w:br/>
       </w:r>
       <w:r>
@@ -2189,7 +2271,11 @@
         <w:br/>
       </w:r>
       <w:r>
-        <w:t>|   |-- common/                   tracking_store.py, knowledge_store.py (shared)</w:t>
+        <w:t>|   |-- common/                   tracking_store.py, knowledge_store.py,</w:t>
+        <w:br/>
+      </w:r>
+      <w:r>
+        <w:t>|   |                             telemetry.py (OBS-02; no-op unless deployed) (shared)</w:t>
         <w:br/>
       </w:r>
       <w:r>
@@ -2197,11 +2283,11 @@
         <w:br/>
       </w:r>
       <w:r>
-        <w:t>|   |-- knowledge_agent/          main.py, retrieval.py</w:t>
+        <w:t>|   |-- knowledge_agent/          main.py, retrieval.py (no Dockerfile -- runs inside Fixer)</w:t>
         <w:br/>
       </w:r>
       <w:r>
-        <w:t>|   |-- classifier/               main.py, rules.py</w:t>
+        <w:t>|   |-- classifier/               rules.py only (no main.py, no Dockerfile -- runs inside Fixer)</w:t>
         <w:br/>
       </w:r>
       <w:r>
@@ -2217,7 +2303,11 @@
         <w:br/>
       </w:r>
       <w:r>
-        <w:t>|   `-- watcher/                  main.py, ci_status.py, retry_gate.py, pattern_learner.py</w:t>
+        <w:t>|   `-- watcher/                  main.py, ci_status.py, retry_gate.py, pattern_learner.py,</w:t>
+        <w:br/>
+      </w:r>
+      <w:r>
+        <w:t>|                                  retry_controller.py + cosmos_counter.py (legacy, unused)</w:t>
         <w:br/>
       </w:r>
       <w:r>
@@ -2250,7 +2340,7 @@
           <w:i w:val="0"/>
           <w:sz w:val="21"/>
         </w:rPr>
-        <w:t>Each agents/* subpackage builds into its own container image; no agent has a runtime dependency on another agent's container. Only agents/common is copied into more than one image.</w:t>
+        <w:t>Each of Fixer and Watcher builds into its own container image; no agent has a runtime dependency on another agent's container. agents/common (including telemetry.py) is copied into both images. The Knowledge Agent and Classifier are not separate images at all — their source is copied into the Fixer's image and imported in-process by agents/fixer/main.py.</w:t>
       </w:r>
     </w:p>
     <w:p>
@@ -2710,7 +2800,7 @@
           <w:i w:val="0"/>
           <w:sz w:val="21"/>
         </w:rPr>
-        <w:t>Runs as a lightweight container: no Maven, no git.</w:t>
+        <w:t>Not a separate container: agents/fixer/main.py imports KnowledgeAgent from knowledge_agent.main directly and runs it in-process. There is no knowledge_agent/Dockerfile; its source is copied into the Fixer's own image instead (COPY agents/knowledge_agent/ in agents/fixer/Dockerfile).</w:t>
       </w:r>
     </w:p>
     <w:p>
@@ -3040,7 +3130,7 @@
           <w:i w:val="0"/>
           <w:sz w:val="21"/>
         </w:rPr>
-        <w:t>The Classifier writes the bucket and its rationale to the tracking record before returning.</w:t>
+        <w:t>The Classifier writes the bucket and its rationale to the tracking record before returning. Like the Knowledge Agent, this is not a separate container — agents/fixer/main.py imports Classifier from classifier.rules directly; there is no classifier/main.py or classifier/Dockerfile, only rules.py, copied into the Fixer's image the same way.</w:t>
       </w:r>
     </w:p>
     <w:p>
@@ -3074,10 +3164,15 @@
     </w:p>
     <w:p>
       <w:pPr>
-        <w:pStyle w:val="ListBullet"/>
-      </w:pPr>
-      <w:r>
-        <w:t>Reads the bucket assigned by the Classifier from the tracking record.</w:t>
+        <w:spacing w:after="160"/>
+      </w:pPr>
+      <w:r>
+        <w:rPr>
+          <w:b w:val="0"/>
+          <w:i w:val="0"/>
+          <w:sz w:val="21"/>
+        </w:rPr>
+        <w:t>Design intent — not yet implemented: a KB-hit fast path was designed where, on a Knowledge Store hit for (component, old_version, new_version), stored find/replace pairs would be applied directly via apply_file_change, then run_build/run_unit_tests would verify, skipping the LLM call entirely on success. CodeFixer.run_fresh_fix() has no kb_entry parameter today and no KB-hit branch — every fix, including Bucket 3, runs the full Claude tool-use loop with no KB context injected. This was confirmed while wiring up Azure Monitor telemetry (Section 5.7): agents/fixer/main.py was calling run_fresh_fix(..., kb_entry=kb_entry), which raised TypeError on every fresh-scan fix attempt since the method never accepted that argument. The crash is fixed (the stray argument removed); the KB-hit fast path itself remains a tracked gap, not a false claim left uncorrected. See Section 11.</w:t>
       </w:r>
     </w:p>
     <w:p>
@@ -3085,7 +3180,7 @@
         <w:pStyle w:val="ListBullet"/>
       </w:pPr>
       <w:r>
-        <w:t>Checks the Knowledge Store for a hit on (component, old_version, new_version). On a hit, stored find/replace pairs are applied directly via apply_file_change, then run_build and run_unit_tests are executed; if both pass, the LLM is skipped entirely. If direct application fails, the agent falls back to the Claude tool-use loop with the KB entry injected as context.</w:t>
+        <w:t>Reads the bucket assigned by the Classifier from the tracking record.</w:t>
       </w:r>
     </w:p>
     <w:p>
@@ -5015,7 +5110,7 @@
         <w:pStyle w:val="Heading2"/>
       </w:pPr>
       <w:r>
-        <w:t>5.6 Observability Dashboard</w:t>
+        <w:t>5.6 Observability Dashboard (Local — Streamlit)</w:t>
       </w:r>
     </w:p>
     <w:p>
@@ -5028,7 +5123,7 @@
           <w:i w:val="0"/>
           <w:sz w:val="21"/>
         </w:rPr>
-        <w:t>streamlit_dashboard.py is a read-only, local-only Streamlit app for the POC. It connects to the tracking store and knowledge store via the same make_tracking_store()/make_knowledge_store() factories the agents use, selecting Cosmos or InMemory based on DEPLOYMENT_MODE. No hosting story is required for the POC — any team member runs it on their own laptop with az login and an appropriate Cosmos RBAC assignment (Data Reader, narrower than the agents' Data Contributor role).</w:t>
+        <w:t>streamlit_dashboard.py is a read-only, local-only Streamlit app for the POC. It connects to the tracking store and knowledge store via the same make_tracking_store()/make_knowledge_store() factories the agents use, selecting Cosmos or InMemory based on DEPLOYMENT_MODE. No hosting story is required for the POC — any team member runs it on their own laptop with az login and an appropriate Cosmos RBAC assignment (Data Reader, narrower than the agents' Data Contributor role). This remains the tool for local testing (TESTING_DOCKER.md / TESTING_PODMAN.md) regardless of the AAF-deployment-only Azure Monitor layer described in Section 5.7.</w:t>
       </w:r>
     </w:p>
     <w:tbl>
@@ -5238,6 +5333,428 @@
           <w:sz w:val="21"/>
         </w:rPr>
         <w:t>Tabs render independently with their own empty-state messaging — the Knowledge Base tab is useful before the first tracking record exists, since the Knowledge Agent hydrates the KB before any PR is opened. While fix attempts are in flight (CREATED records exist), the page injects a 10-second meta-refresh so it stays current without user action.</w:t>
+      </w:r>
+    </w:p>
+    <w:p>
+      <w:pPr>
+        <w:pStyle w:val="Heading2"/>
+      </w:pPr>
+      <w:r>
+        <w:t>5.7 Azure Monitor Telemetry — AAF Deployment Only (OBS-02)</w:t>
+      </w:r>
+    </w:p>
+    <w:p>
+      <w:pPr>
+        <w:spacing w:after="160"/>
+      </w:pPr>
+      <w:r>
+        <w:rPr>
+          <w:b w:val="0"/>
+          <w:i w:val="0"/>
+          <w:sz w:val="21"/>
+        </w:rPr>
+        <w:t>Deployment split: Azure Monitor telemetry activates only when APPLICATIONINSIGHTS_CONNECTION_STRING is set, which happens only in the deployed agent YAML files. Local testing is entirely unaffected and continues to use Streamlit (Section 5.6) exclusively.</w:t>
+      </w:r>
+    </w:p>
+    <w:p>
+      <w:pPr>
+        <w:spacing w:after="160"/>
+      </w:pPr>
+      <w:r>
+        <w:rPr>
+          <w:b w:val="0"/>
+          <w:i w:val="0"/>
+          <w:sz w:val="21"/>
+        </w:rPr>
+        <w:t>Why Azure Monitor over Grafana Managed / Power BI / hosting Streamlit: Azure Monitor Workbooks are free — the only cost is Log Analytics ingestion (first 5 GB/month free per workspace, then roughly $2.30-2.76/GB depending on region), which at this project's fix-attempt volume should stay at or near $0/month. This is materially cheaper than Azure Managed Grafana (per-tier/user cost) or Power BI (Pro license required to share, ~$10/user/month), and needs no compute host of its own — unlike Streamlit today, which has no real deployed-hosting story.</w:t>
+      </w:r>
+    </w:p>
+    <w:p>
+      <w:pPr>
+        <w:spacing w:after="160"/>
+      </w:pPr>
+      <w:r>
+        <w:rPr>
+          <w:b w:val="0"/>
+          <w:i w:val="0"/>
+          <w:sz w:val="21"/>
+        </w:rPr>
+        <w:t>What's provisioned (infra/main.bicep): a Log Analytics workspace (PerGB2018, 30-day retention); a workspace-based Application Insights component (classic App Insights is deprecated); and an Azure Monitor Workbook, deployed automatically from infra/observability/remediation-workbook.json and bound to the App Insights resource via sourceId. Panels: run history, retry lineage / resolutions / escalations, token usage by CVE/component, token usage over time, fresh-scan vs. retry token cost, and resolved-vs-escalated counts over time. This Workbook JSON schema has not been verified against a live Azure deployment — the same caveat class as the Nexus IQ API contract and the AAF SDK call in scripts/update_agent.py (Section 11). infra/observability/queries.kql has the identical KQL as a guaranteed-usable fallback if the deployed Workbook doesn't render as expected.</w:t>
+      </w:r>
+    </w:p>
+    <w:p>
+      <w:pPr>
+        <w:spacing w:after="160"/>
+      </w:pPr>
+      <w:r>
+        <w:rPr>
+          <w:b w:val="0"/>
+          <w:i w:val="0"/>
+          <w:sz w:val="21"/>
+        </w:rPr>
+        <w:t>What's instrumented (agents/common/telemetry.py): a thin wrapper around the azure-monitor-opentelemetry distro. init_telemetry(role_name) is called once near the top of each agent's main(); emit_event(event_name, **fields) logs a structured event, captured by Azure Monitor's logging auto-instrumentation and exported to Application Insights' traces table with every keyword argument landing in customDimensions; shutdown_telemetry() flushes the exporter's batch queue before process exit — necessary because the Fixer and Watcher are one-shot scripts, not long-running servers, so an unflushed batch on exit would silently drop the last events.</w:t>
+      </w:r>
+    </w:p>
+    <w:tbl>
+      <w:tblPr>
+        <w:tblStyle w:val="TableGrid"/>
+        <w:tblW w:type="auto" w:w="0"/>
+        <w:jc w:val="center"/>
+        <w:tblLayout w:type="autofit"/>
+        <w:tblLook w:firstColumn="1" w:firstRow="1" w:lastColumn="0" w:lastRow="0" w:noHBand="0" w:noVBand="1" w:val="04A0"/>
+      </w:tblPr>
+      <w:tblGrid>
+        <w:gridCol w:w="2880"/>
+        <w:gridCol w:w="2880"/>
+        <w:gridCol w:w="2880"/>
+      </w:tblGrid>
+      <w:tr>
+        <w:tc>
+          <w:tcPr>
+            <w:tcW w:type="dxa" w:w="2304"/>
+            <w:shd w:val="clear" w:color="auto" w:fill="1F3A5F"/>
+          </w:tcPr>
+          <w:p>
+            <w:r/>
+            <w:r>
+              <w:rPr>
+                <w:rFonts w:ascii="Calibri" w:hAnsi="Calibri"/>
+                <w:b/>
+                <w:color w:val="FFFFFF"/>
+                <w:sz w:val="19"/>
+              </w:rPr>
+              <w:t>Event</w:t>
+            </w:r>
+          </w:p>
+        </w:tc>
+        <w:tc>
+          <w:tcPr>
+            <w:tcW w:type="dxa" w:w="3456"/>
+            <w:shd w:val="clear" w:color="auto" w:fill="1F3A5F"/>
+          </w:tcPr>
+          <w:p>
+            <w:r/>
+            <w:r>
+              <w:rPr>
+                <w:rFonts w:ascii="Calibri" w:hAnsi="Calibri"/>
+                <w:b/>
+                <w:color w:val="FFFFFF"/>
+                <w:sz w:val="19"/>
+              </w:rPr>
+              <w:t>Where</w:t>
+            </w:r>
+          </w:p>
+        </w:tc>
+        <w:tc>
+          <w:tcPr>
+            <w:tcW w:type="dxa" w:w="3888"/>
+            <w:shd w:val="clear" w:color="auto" w:fill="1F3A5F"/>
+          </w:tcPr>
+          <w:p>
+            <w:r/>
+            <w:r>
+              <w:rPr>
+                <w:rFonts w:ascii="Calibri" w:hAnsi="Calibri"/>
+                <w:b/>
+                <w:color w:val="FFFFFF"/>
+                <w:sz w:val="19"/>
+              </w:rPr>
+              <w:t>What it captures</w:t>
+            </w:r>
+          </w:p>
+        </w:tc>
+      </w:tr>
+      <w:tr>
+        <w:tc>
+          <w:tcPr>
+            <w:tcW w:type="dxa" w:w="2304"/>
+            <w:shd w:val="clear" w:color="auto" w:fill="FFFFFF"/>
+          </w:tcPr>
+          <w:p>
+            <w:r/>
+            <w:r>
+              <w:rPr>
+                <w:rFonts w:ascii="Calibri" w:hAnsi="Calibri"/>
+                <w:b w:val="0"/>
+                <w:sz w:val="19"/>
+              </w:rPr>
+              <w:t>FixAttemptCompleted</w:t>
+            </w:r>
+          </w:p>
+        </w:tc>
+        <w:tc>
+          <w:tcPr>
+            <w:tcW w:type="dxa" w:w="3456"/>
+            <w:shd w:val="clear" w:color="auto" w:fill="FFFFFF"/>
+          </w:tcPr>
+          <w:p>
+            <w:r/>
+            <w:r>
+              <w:rPr>
+                <w:rFonts w:ascii="Calibri" w:hAnsi="Calibri"/>
+                <w:b w:val="0"/>
+                <w:sz w:val="19"/>
+              </w:rPr>
+              <w:t>code_fixer.py — run_fresh_fix() and run_retry_fix()</w:t>
+            </w:r>
+          </w:p>
+        </w:tc>
+        <w:tc>
+          <w:tcPr>
+            <w:tcW w:type="dxa" w:w="3888"/>
+            <w:shd w:val="clear" w:color="auto" w:fill="FFFFFF"/>
+          </w:tcPr>
+          <w:p>
+            <w:r/>
+            <w:r>
+              <w:rPr>
+                <w:rFonts w:ascii="Calibri" w:hAnsi="Calibri"/>
+                <w:b w:val="0"/>
+                <w:sz w:val="19"/>
+              </w:rPr>
+              <w:t>Component, CVE(s), old/new version, framework, unit-test status, prompt/completion/total tokens, attempt number, fresh vs. retry — the primary source for token usage by CVE fix</w:t>
+            </w:r>
+          </w:p>
+        </w:tc>
+      </w:tr>
+      <w:tr>
+        <w:tc>
+          <w:tcPr>
+            <w:tcW w:type="dxa" w:w="2304"/>
+            <w:shd w:val="clear" w:color="auto" w:fill="EEF2F7"/>
+          </w:tcPr>
+          <w:p>
+            <w:r/>
+            <w:r>
+              <w:rPr>
+                <w:rFonts w:ascii="Calibri" w:hAnsi="Calibri"/>
+                <w:b w:val="0"/>
+                <w:sz w:val="19"/>
+              </w:rPr>
+              <w:t>FixSkipped</w:t>
+            </w:r>
+          </w:p>
+        </w:tc>
+        <w:tc>
+          <w:tcPr>
+            <w:tcW w:type="dxa" w:w="3456"/>
+            <w:shd w:val="clear" w:color="auto" w:fill="EEF2F7"/>
+          </w:tcPr>
+          <w:p>
+            <w:r/>
+            <w:r>
+              <w:rPr>
+                <w:rFonts w:ascii="Calibri" w:hAnsi="Calibri"/>
+                <w:b w:val="0"/>
+                <w:sz w:val="19"/>
+              </w:rPr>
+              <w:t>fixer/main.py, at Bucket 1/4 triage-issue creation</w:t>
+            </w:r>
+          </w:p>
+        </w:tc>
+        <w:tc>
+          <w:tcPr>
+            <w:tcW w:type="dxa" w:w="3888"/>
+            <w:shd w:val="clear" w:color="auto" w:fill="EEF2F7"/>
+          </w:tcPr>
+          <w:p>
+            <w:r/>
+            <w:r>
+              <w:rPr>
+                <w:rFonts w:ascii="Calibri" w:hAnsi="Calibri"/>
+                <w:b w:val="0"/>
+                <w:sz w:val="19"/>
+              </w:rPr>
+              <w:t>Component, CVE(s), bucket, repo — findings the agent never attempted, for a complete picture alongside what it did fix</w:t>
+            </w:r>
+          </w:p>
+        </w:tc>
+      </w:tr>
+      <w:tr>
+        <w:tc>
+          <w:tcPr>
+            <w:tcW w:type="dxa" w:w="2304"/>
+            <w:shd w:val="clear" w:color="auto" w:fill="FFFFFF"/>
+          </w:tcPr>
+          <w:p>
+            <w:r/>
+            <w:r>
+              <w:rPr>
+                <w:rFonts w:ascii="Calibri" w:hAnsi="Calibri"/>
+                <w:b w:val="0"/>
+                <w:sz w:val="19"/>
+              </w:rPr>
+              <w:t>FixResolved</w:t>
+            </w:r>
+          </w:p>
+        </w:tc>
+        <w:tc>
+          <w:tcPr>
+            <w:tcW w:type="dxa" w:w="3456"/>
+            <w:shd w:val="clear" w:color="auto" w:fill="FFFFFF"/>
+          </w:tcPr>
+          <w:p>
+            <w:r/>
+            <w:r>
+              <w:rPr>
+                <w:rFonts w:ascii="Calibri" w:hAnsi="Calibri"/>
+                <w:b w:val="0"/>
+                <w:sz w:val="19"/>
+              </w:rPr>
+              <w:t>watcher/main.py, at CI_PASSED</w:t>
+            </w:r>
+          </w:p>
+        </w:tc>
+        <w:tc>
+          <w:tcPr>
+            <w:tcW w:type="dxa" w:w="3888"/>
+            <w:shd w:val="clear" w:color="auto" w:fill="FFFFFF"/>
+          </w:tcPr>
+          <w:p>
+            <w:r/>
+            <w:r>
+              <w:rPr>
+                <w:rFonts w:ascii="Calibri" w:hAnsi="Calibri"/>
+                <w:b w:val="0"/>
+                <w:sz w:val="19"/>
+              </w:rPr>
+              <w:t>Component, PR number, attempt number, time-to-resolution (computed the same way retry_gate.py already did for FAILED_MAX_RETRIES, just not persisted to the tracking record)</w:t>
+            </w:r>
+          </w:p>
+        </w:tc>
+      </w:tr>
+      <w:tr>
+        <w:tc>
+          <w:tcPr>
+            <w:tcW w:type="dxa" w:w="2304"/>
+            <w:shd w:val="clear" w:color="auto" w:fill="EEF2F7"/>
+          </w:tcPr>
+          <w:p>
+            <w:r/>
+            <w:r>
+              <w:rPr>
+                <w:rFonts w:ascii="Calibri" w:hAnsi="Calibri"/>
+                <w:b w:val="0"/>
+                <w:sz w:val="19"/>
+              </w:rPr>
+              <w:t>FixRetryRequested</w:t>
+            </w:r>
+          </w:p>
+        </w:tc>
+        <w:tc>
+          <w:tcPr>
+            <w:tcW w:type="dxa" w:w="3456"/>
+            <w:shd w:val="clear" w:color="auto" w:fill="EEF2F7"/>
+          </w:tcPr>
+          <w:p>
+            <w:r/>
+            <w:r>
+              <w:rPr>
+                <w:rFonts w:ascii="Calibri" w:hAnsi="Calibri"/>
+                <w:b w:val="0"/>
+                <w:sz w:val="19"/>
+              </w:rPr>
+              <w:t>retry_gate.py, after a successful Fixer invocation</w:t>
+            </w:r>
+          </w:p>
+        </w:tc>
+        <w:tc>
+          <w:tcPr>
+            <w:tcW w:type="dxa" w:w="3888"/>
+            <w:shd w:val="clear" w:color="auto" w:fill="EEF2F7"/>
+          </w:tcPr>
+          <w:p>
+            <w:r/>
+            <w:r>
+              <w:rPr>
+                <w:rFonts w:ascii="Calibri" w:hAnsi="Calibri"/>
+                <w:b w:val="0"/>
+                <w:sz w:val="19"/>
+              </w:rPr>
+              <w:t>PR number, attempt number, parent tracking id — retry-depth visibility over time</w:t>
+            </w:r>
+          </w:p>
+        </w:tc>
+      </w:tr>
+      <w:tr>
+        <w:tc>
+          <w:tcPr>
+            <w:tcW w:type="dxa" w:w="2304"/>
+            <w:shd w:val="clear" w:color="auto" w:fill="FFFFFF"/>
+          </w:tcPr>
+          <w:p>
+            <w:r/>
+            <w:r>
+              <w:rPr>
+                <w:rFonts w:ascii="Calibri" w:hAnsi="Calibri"/>
+                <w:b w:val="0"/>
+                <w:sz w:val="19"/>
+              </w:rPr>
+              <w:t>FixEscalated</w:t>
+            </w:r>
+          </w:p>
+        </w:tc>
+        <w:tc>
+          <w:tcPr>
+            <w:tcW w:type="dxa" w:w="3456"/>
+            <w:shd w:val="clear" w:color="auto" w:fill="FFFFFF"/>
+          </w:tcPr>
+          <w:p>
+            <w:r/>
+            <w:r>
+              <w:rPr>
+                <w:rFonts w:ascii="Calibri" w:hAnsi="Calibri"/>
+                <w:b w:val="0"/>
+                <w:sz w:val="19"/>
+              </w:rPr>
+              <w:t>retry_gate.py — both the retry-limit and invocation-failure paths</w:t>
+            </w:r>
+          </w:p>
+        </w:tc>
+        <w:tc>
+          <w:tcPr>
+            <w:tcW w:type="dxa" w:w="3888"/>
+            <w:shd w:val="clear" w:color="auto" w:fill="FFFFFF"/>
+          </w:tcPr>
+          <w:p>
+            <w:r/>
+            <w:r>
+              <w:rPr>
+                <w:rFonts w:ascii="Calibri" w:hAnsi="Calibri"/>
+                <w:b w:val="0"/>
+                <w:sz w:val="19"/>
+              </w:rPr>
+              <w:t>PR number, attempt number, reason (max_retries_reached vs. fixer_invocation_failed), time-to-resolution</w:t>
+            </w:r>
+          </w:p>
+        </w:tc>
+      </w:tr>
+    </w:tbl>
+    <w:p/>
+    <w:p>
+      <w:pPr>
+        <w:spacing w:after="160"/>
+      </w:pPr>
+      <w:r>
+        <w:rPr>
+          <w:b w:val="0"/>
+          <w:i w:val="0"/>
+          <w:sz w:val="21"/>
+        </w:rPr>
+        <w:t>Fail-safe behavior (hard requirement): nothing in telemetry.py may ever raise into a caller. If APPLICATIONINSIGHTS_CONNECTION_STRING is unset, init_telemetry() logs one informational line and returns False — the expected, non-error state for local testing. If it's set but initialization fails for any reason (malformed connection string, DNS/network failure, package import error), the failure is caught, logged as an ERROR, and telemetry is disabled for the rest of that process — the fix/watch run continues exactly as it would with no telemetry configured at all. Verified directly: both the unset and malformed-connection-string paths return cleanly with no exception propagating.</w:t>
+      </w:r>
+    </w:p>
+    <w:p>
+      <w:pPr>
+        <w:spacing w:after="160"/>
+      </w:pPr>
+      <w:r>
+        <w:rPr>
+          <w:b w:val="0"/>
+          <w:i w:val="0"/>
+          <w:sz w:val="21"/>
+        </w:rPr>
+        <w:t>Complementary, code-free platform metrics: independent of the above, enabling diagnostic settings on the Azure AI Foundry model deployment itself (routed to the same Log Analytics workspace) surfaces Azure AI Foundry's own built-in token/request/latency metrics at the platform level, with zero code changes — a useful cross-check against the custom FixAttemptCompleted token totals, though it can't attribute tokens back to a specific CVE the way the custom events can. This can't be automated by this project's Bicep, since the Foundry project isn't a resource it provisions.</w:t>
       </w:r>
     </w:p>
     <w:p>
@@ -7664,7 +8181,7 @@
           <w:i w:val="0"/>
           <w:sz w:val="21"/>
         </w:rPr>
-        <w:t>The Bicep template declares the Azure resources that must exist before any agent can run: an Azure Container Registry (ACR) for container images, a Key Vault for the GitHub PAT and Nexus IQ key, and a Cosmos DB Serverless account with the oss-remediation database and its three containers (Section 6.5). It does not provision the Foundry project itself — only references an existing one, since account/project creation requires subscription-level access this team does not have.</w:t>
+        <w:t>The Bicep template declares the Azure resources that must exist before any agent can run: an Azure Container Registry (ACR) for container images, a Key Vault for the GitHub PAT, Nexus IQ key, and Anthropic API key, a Cosmos DB Serverless account with the oss-remediation database and its three containers (Section 6.5), and — for observability (Section 5.7 / OBS-02) — a Log Analytics workspace, a workspace-based Application Insights component, and an Azure Monitor Workbook deployed from infra/observability/remediation-workbook.json. It does not provision the Foundry project itself — only references an existing one, since account/project creation requires subscription-level access this team does not have.</w:t>
       </w:r>
     </w:p>
     <w:p>
@@ -7685,7 +8202,7 @@
           <w:i w:val="0"/>
           <w:sz w:val="21"/>
         </w:rPr>
-        <w:t>Each Hosted Agent has a definition file: name, container image reference, cron schedule, environment variables, Key Vault secret references, and identity scopes. The Watcher's definition adds COSMOS_ENDPOINT, COSMOS_DATABASE, COSMOS_CONTAINER, and MAX_RETRY_ATTEMPTS; the Fixer's adds NEXUS_IQ_APP_PUBLIC_ID, GITHUB_REPO_TARGET, and MODEL_DEPLOYMENT_NAME.</w:t>
+        <w:t>Each Hosted Agent has a definition file: name, container image reference, cron schedule, environment variables, Key Vault secret references, and identity scopes. Both agent yaml files set DEPLOYMENT_MODE=azure directly (a fixed constant, not templated from config) to pin the store/vulnerability-source backend selection explicitly rather than relying on the deployment mode's "unset" fallback (Section 2.2). The Watcher's definition adds COSMOS_ENDPOINT, COSMOS_DATABASE, COSMOS_CONTAINER, MAX_RETRY_ATTEMPTS, and APPLICATIONINSIGHTS_CONNECTION_STRING; the Fixer's adds NEXUS_IQ_APP_PUBLIC_ID, GITHUB_REPO_TARGET, MODEL_DEPLOYMENT_NAME, the same APPLICATIONINSIGHTS_CONNECTION_STRING, and an ANTHROPIC_API_KEY Key Vault secretRef — required because code_fixer.py and the inline Knowledge Agent both call anthropic.Anthropic(), which reads that env var directly regardless of MODEL_DEPLOYMENT_NAME naming a Foundry-hosted deployment. APPLICATIONINSIGHTS_CONNECTION_STRING is a plain value, not a secretRef — the same convention as COSMOS_ENDPOINT, since it only grants write access to telemetry ingestion, not read access to any data.</w:t>
       </w:r>
     </w:p>
     <w:p>
@@ -7813,7 +8330,7 @@
                 <w:b w:val="0"/>
                 <w:sz w:val="19"/>
               </w:rPr>
-              <w:t>Deploys the Bicep template, captures outputs (ACR login server, Key Vault URI, Cosmos endpoint) to .env.infra, and prints the manual RBAC grant commands the AAF-access person must run</w:t>
+              <w:t>Deploys the Bicep template and writes its outputs (ACR login server, Key Vault URI, Cosmos endpoint, App Insights connection string, etc.) directly into config.yaml's infra: section, then prints the manual RBAC grant commands the AAF-access person must run</w:t>
             </w:r>
           </w:p>
         </w:tc>
@@ -7923,7 +8440,7 @@
         <w:pStyle w:val="ListNumber"/>
       </w:pPr>
       <w:r>
-        <w:t>Populate Key Vault secrets (GitHub PAT, Nexus IQ API key) — the empty vault with RBAC authorization enabled is provisioned by Bicep; the Cosmos endpoint itself is a plain env var, not a secret.</w:t>
+        <w:t>Populate Key Vault secrets: GitHub PAT, Nexus IQ API key, and Anthropic API key (the third is easy to miss since it isn't an Azure-native credential) — the empty vault with RBAC authorization enabled is provisioned by Bicep; the Cosmos endpoint and App Insights connection string are plain env vars, not secrets.</w:t>
       </w:r>
     </w:p>
     <w:p>
@@ -7931,7 +8448,7 @@
         <w:pStyle w:val="ListNumber"/>
       </w:pPr>
       <w:r>
-        <w:t>Run bootstrap_foundry_project.sh once, then update_agent.py for every subsequent change.</w:t>
+        <w:t>Run: cp config.yaml.example config.yaml, then bootstrap_foundry_project.sh once, then update_agent.py for every subsequent change.</w:t>
       </w:r>
     </w:p>
     <w:p>
@@ -7939,11 +8456,19 @@
         <w:pStyle w:val="ListNumber"/>
       </w:pPr>
       <w:r>
-        <w:t>Run the manual smoke test: trigger the Fixer once against a test repo, confirm a PR is created with a tracking record and a passing compile gate visible in the container logs, confirm the Watcher reacts to a deliberately broken CI run, and confirm the retry bound stops after MAX_RETRY_ATTEMPTS.</w:t>
+        <w:t>Optional (Section 5.7): enable diagnostic settings on the Foundry model deployment, routed to the bootstrap-provisioned Log Analytics workspace, for code-free platform-level token/request metrics.</w:t>
       </w:r>
     </w:p>
     <w:p>
       <w:pPr>
+        <w:pStyle w:val="ListNumber"/>
+      </w:pPr>
+      <w:r>
+        <w:t>Run the manual smoke test: trigger the Fixer once against a test repo, confirm a PR is created with a tracking record and a passing compile gate visible in the container logs, confirm the Watcher reacts to a deliberately broken CI run, confirm the retry bound stops after MAX_RETRY_ATTEMPTS, and confirm the Azure Monitor Workbook shows the run.</w:t>
+      </w:r>
+    </w:p>
+    <w:p>
+      <w:pPr>
         <w:pStyle w:val="CodeBlock"/>
         <w:shd w:val="clear" w:color="auto" w:fill="F2F2F2"/>
       </w:pPr>
@@ -8001,7 +8526,7 @@
         <w:pStyle w:val="ListBullet"/>
       </w:pPr>
       <w:r>
-        <w:t>Secrets (GitHub PAT, Nexus IQ API key) live in Key Vault with RBAC authorization enabled — never in environment variables or source.</w:t>
+        <w:t>Secrets (GitHub PAT, Nexus IQ API key, Anthropic API key) live in Key Vault with RBAC authorization enabled — never in environment variables or source. The Application Insights connection string is the one deliberate exception, following the same plain-env-var convention as COSMOS_ENDPOINT, since it only grants write access to telemetry ingestion.</w:t>
       </w:r>
     </w:p>
     <w:p>
@@ -8046,15 +8571,7 @@
           <w:i w:val="0"/>
           <w:sz w:val="21"/>
         </w:rPr>
-        <w:t>The tests/ directory covers everything testable without AAF access: Nexus/scan-report client parsing, the code fixer's tool dispatch, per-framework build/test behavior, and the retry gate's safety properties. Each test module has isolated fixtures so a schema change (e.g. to TrackingRecord) requires updating exactly one place. Test names describe safety properties rather than method names, e.g. test_fixer_refuses_when_status_is_not_retry_requested, test_apply_file_change_returns_error_not_silent_skip_when_find_string_absent, test_compile_failure_surfaces_stderr_not_exception. .github/workflows/ci.yml lints and tests this repository's own orchestration code — separate from the customer's CI pipeline that the Fixer's PRs trigger.</w:t>
-      </w:r>
-    </w:p>
-    <w:p>
-      <w:pPr>
-        <w:pStyle w:val="Heading2"/>
-      </w:pPr>
-      <w:r>
-        <w:t>10.3 Observability</w:t>
+        <w:t>The tests/ directory covers everything testable without AAF access: Nexus/scan-report client parsing, the code fixer's tool dispatch, and per-framework build/test behavior. Each test module has isolated fixtures so a schema change (e.g. to TrackingRecord) requires updating exactly one place. Test names describe safety properties rather than method names, e.g. test_fixer_refuses_when_status_is_not_retry_requested, test_apply_file_change_returns_error_not_silent_skip_when_find_string_absent, test_compile_failure_surfaces_stderr_not_exception. .github/workflows/ci.yml lints and tests this repository's own orchestration code — separate from the customer's CI pipeline that the Fixer's PRs trigger.</w:t>
       </w:r>
     </w:p>
     <w:p>
@@ -8067,7 +8584,28 @@
           <w:i w:val="0"/>
           <w:sz w:val="21"/>
         </w:rPr>
-        <w:t>The Streamlit dashboard (Section 5.6) is the primary POC observability surface: run history, retry lineage, resolution-rate/latency/token metrics, and Knowledge Base contents. Tracking-record fields (token_usage, time_to_resolution_seconds, unit_test_status, bucket) are written by the agents specifically so this data does not need to be reconstructed from logs.</w:t>
+        <w:t>Known coverage gap: RetryGate — the live retry-bound/escalation logic agents/watcher/main.py actually imports — has no dedicated unit test file today. tests/test_retry_controller.py tests a different, unused module (retry_controller.py) left over from an earlier design where the Watcher called Claude directly to diagnose CI failures; that responsibility now lives entirely in the Fixer. See Section 11 for the full writeup.</w:t>
+      </w:r>
+    </w:p>
+    <w:p>
+      <w:pPr>
+        <w:pStyle w:val="Heading2"/>
+      </w:pPr>
+      <w:r>
+        <w:t>10.3 Observability</w:t>
+      </w:r>
+    </w:p>
+    <w:p>
+      <w:pPr>
+        <w:spacing w:after="160"/>
+      </w:pPr>
+      <w:r>
+        <w:rPr>
+          <w:b w:val="0"/>
+          <w:i w:val="0"/>
+          <w:sz w:val="21"/>
+        </w:rPr>
+        <w:t>Two layers, split by deployment target (Section 5.6 / 5.7). Locally, the Streamlit dashboard is the observability surface: run history, retry lineage, resolution-rate/latency/token metrics, and Knowledge Base contents. On an AAF deployment, Azure Monitor Workbooks take over — the same class of data plus token-usage-by-CVE and over-time views the Streamlit dashboard doesn't have, at near-zero incremental cost. Tracking-record fields (token_usage, time_to_resolution_seconds, unit_test_status) and the FixAttemptCompleted/FixResolved/FixEscalated telemetry events are both written by the agents specifically so this data does not need to be reconstructed from logs.</w:t>
       </w:r>
     </w:p>
     <w:p>
@@ -8589,6 +9127,110 @@
     </w:tbl>
     <w:p/>
     <w:p>
+      <w:pPr>
+        <w:pStyle w:val="Heading2"/>
+      </w:pPr>
+      <w:r>
+        <w:t>11.5 Implementation Gaps Found During the Observability Pass (OBS-02)</w:t>
+      </w:r>
+    </w:p>
+    <w:p>
+      <w:pPr>
+        <w:spacing w:after="160"/>
+      </w:pPr>
+      <w:r>
+        <w:rPr>
+          <w:b w:val="0"/>
+          <w:i w:val="0"/>
+          <w:sz w:val="21"/>
+        </w:rPr>
+        <w:t>Adding Azure Monitor telemetry (Section 5.7) required tracing every hook point in the Fixer and Watcher, which surfaced several pre-existing gaps between this document's earlier claims and the actual implementation. Recorded here rather than silently corrected out of the historical record:</w:t>
+      </w:r>
+    </w:p>
+    <w:p>
+      <w:pPr>
+        <w:pStyle w:val="ListBullet"/>
+      </w:pPr>
+      <w:r>
+        <w:rPr>
+          <w:b/>
+        </w:rPr>
+        <w:t xml:space="preserve">KB-hit fast path not implemented: </w:t>
+      </w:r>
+      <w:r>
+        <w:t>CodeFixer had no kb_entry parameter and no KB-hit branch, despite being described as implemented earlier in this document (Section 5.4). Every fix, including Bucket 3, runs the full Claude tool-use loop with no KB context injected. Worse, agents/fixer/main.py was calling run_fresh_fix(..., kb_entry=kb_entry) — an argument the method never accepted — which raised TypeError on every single fresh-scan fix attempt. That crash is now fixed (the stray argument removed); the KB-hit fast path itself remains unbuilt, a separate and larger piece of work than this observability pass.</w:t>
+      </w:r>
+    </w:p>
+    <w:p>
+      <w:pPr>
+        <w:pStyle w:val="ListBullet"/>
+      </w:pPr>
+      <w:r>
+        <w:rPr>
+          <w:b/>
+        </w:rPr>
+        <w:t xml:space="preserve">RetryGate has no dedicated test coverage: </w:t>
+      </w:r>
+      <w:r>
+        <w:t>tests/test_retry_controller.py tests agents/watcher/retry_controller.py, an earlier, unused design where the Watcher called Claude directly — not agents/watcher/retry_gate.py, which agents/watcher/main.py actually imports and which PLAN.md sections 4.5/4.6 describe as the live retry-bound/escalation logic.</w:t>
+      </w:r>
+    </w:p>
+    <w:p>
+      <w:pPr>
+        <w:pStyle w:val="ListBullet"/>
+      </w:pPr>
+      <w:r>
+        <w:rPr>
+          <w:b/>
+        </w:rPr>
+        <w:t xml:space="preserve">Azure Monitor Workbook JSON is unverified: </w:t>
+      </w:r>
+      <w:r>
+        <w:t>infra/observability/remediation-workbook.json was authored against the documented Workbook ARM schema but has not been deployed against a live Azure subscription to confirm it renders correctly. infra/observability/queries.kql carries the identical KQL as a lower-risk, guaranteed-usable fallback.</w:t>
+      </w:r>
+    </w:p>
+    <w:p>
+      <w:pPr>
+        <w:pStyle w:val="ListBullet"/>
+      </w:pPr>
+      <w:r>
+        <w:rPr>
+          <w:b/>
+        </w:rPr>
+        <w:t xml:space="preserve">update_agent.py does not yet wire the container spec into the Foundry SDK call: </w:t>
+      </w:r>
+      <w:r>
+        <w:t>the current create_or_update_agent() only passes name, instructions, and model to AIProjectClient — not the container image, environment variables, or schedule from the rendered agent YAML. The *.rendered.yaml files it writes are the source of truth for what the container/env/schedule should be until this is confirmed against the current azure-ai-projects SDK and wired up.</w:t>
+      </w:r>
+    </w:p>
+    <w:p>
+      <w:pPr>
+        <w:pStyle w:val="ListBullet"/>
+      </w:pPr>
+      <w:r>
+        <w:rPr>
+          <w:b/>
+        </w:rPr>
+        <w:t xml:space="preserve">Key Vault secretRef syntax in infra/agents/*.agent.yaml is unconfirmed: </w:t>
+      </w:r>
+      <w:r>
+        <w:t>against current AAF Hosted Agent documentation — flagged in the source with a TODO rather than guessed at.</w:t>
+      </w:r>
+    </w:p>
+    <w:p>
+      <w:pPr>
+        <w:spacing w:after="160"/>
+      </w:pPr>
+      <w:r>
+        <w:rPr>
+          <w:b w:val="0"/>
+          <w:i w:val="0"/>
+          <w:sz w:val="21"/>
+        </w:rPr>
+        <w:t>None of these block the AAF deployment steps in Section 9 — DEPLOYMENT_AAF.md's own "Known Gaps to Track" section carries the live, maintained version of this list.</w:t>
+      </w:r>
+    </w:p>
+    <w:p>
       <w:r>
         <w:br w:type="page"/>
       </w:r>
@@ -8685,11 +9327,7 @@
         <w:br/>
       </w:r>
       <w:r>
-        <w:t>|-- README.md</w:t>
-        <w:br/>
-      </w:r>
-      <w:r>
-        <w:t>|-- PLAN.md</w:t>
+        <w:t>|-- README.md, PLAN.md, DEPLOYMENT_AAF.md, TESTING_DOCKER.md, TESTING_PODMAN.md</w:t>
         <w:br/>
       </w:r>
       <w:r>
@@ -8697,7 +9335,11 @@
         <w:br/>
       </w:r>
       <w:r>
-        <w:t>|-- streamlit_dashboard.py              observability dashboard (co-branded Neurealm x Premier)</w:t>
+        <w:t>|-- config.yaml.example                 cp to config.yaml (gitignored) to deploy</w:t>
+        <w:br/>
+      </w:r>
+      <w:r>
+        <w:t>|-- streamlit_dashboard.py              local observability dashboard (co-branded Neurealm x Premier)</w:t>
         <w:br/>
       </w:r>
       <w:r>
@@ -8705,7 +9347,23 @@
         <w:br/>
       </w:r>
       <w:r>
-        <w:t>|   |-- main.bicep                      ACR, Key Vault, Cosmos DB (Serverless)</w:t>
+        <w:t>|   |-- main.bicep                      ACR, Key Vault, Cosmos DB (Serverless),</w:t>
+        <w:br/>
+      </w:r>
+      <w:r>
+        <w:t>|   |                                   Log Analytics + App Insights + Workbook (OBS-02)</w:t>
+        <w:br/>
+      </w:r>
+      <w:r>
+        <w:t>|   |-- observability/</w:t>
+        <w:br/>
+      </w:r>
+      <w:r>
+        <w:t>|   |   |-- remediation-workbook.json   Azure Monitor Workbook (deployed by main.bicep)</w:t>
+        <w:br/>
+      </w:r>
+      <w:r>
+        <w:t>|   |   `-- queries.kql                 same KQL standalone -- fallback if the Workbook doesn't render</w:t>
         <w:br/>
       </w:r>
       <w:r>
@@ -8749,7 +9407,15 @@
         <w:br/>
       </w:r>
       <w:r>
-        <w:t>|   |   `-- knowledge_store.py          KB read/write abstraction (Cosmos + InMemory)</w:t>
+        <w:t>|   |   |-- knowledge_store.py          KB read/write abstraction (Cosmos + InMemory)</w:t>
+        <w:br/>
+      </w:r>
+      <w:r>
+        <w:t>|   |   `-- telemetry.py                OBS-02: Azure Monitor telemetry; no-op unless</w:t>
+        <w:br/>
+      </w:r>
+      <w:r>
+        <w:t>|   |                                   APPLICATIONINSIGHTS_CONNECTION_STRING is set (AAF only)</w:t>
         <w:br/>
       </w:r>
       <w:r>
@@ -8769,11 +9435,7 @@
         <w:br/>
       </w:r>
       <w:r>
-        <w:t>|   |-- knowledge_agent/</w:t>
-        <w:br/>
-      </w:r>
-      <w:r>
-        <w:t>|   |   |-- Dockerfile                  lightweight; web search tools only</w:t>
+        <w:t>|   |-- knowledge_agent/                no Dockerfile -- runs in-process inside the Fixer container</w:t>
         <w:br/>
       </w:r>
       <w:r>
@@ -8785,15 +9447,7 @@
         <w:br/>
       </w:r>
       <w:r>
-        <w:t>|   |-- classifier/                     runs after KB hydration</w:t>
-        <w:br/>
-      </w:r>
-      <w:r>
-        <w:t>|   |   |-- Dockerfile                  lightweight; no Maven, no git</w:t>
-        <w:br/>
-      </w:r>
-      <w:r>
-        <w:t>|   |   |-- main.py                     reads KB per finding; assigns bucket; creates Issues / invokes Fixer</w:t>
+        <w:t>|   |-- classifier/                     no Dockerfile, no main.py -- runs inside the Fixer container</w:t>
         <w:br/>
       </w:r>
       <w:r>
@@ -8805,7 +9459,11 @@
         <w:br/>
       </w:r>
       <w:r>
-        <w:t>|   |   |-- Dockerfile                  multi-runtime: JDK 17 + Maven, Node 20 + npm, Python 3.11</w:t>
+        <w:t>|   |   |-- Dockerfile                  multi-runtime: JDK 17 + Maven, Node 20 + npm, Python 3.11;</w:t>
+        <w:br/>
+      </w:r>
+      <w:r>
+        <w:t>|   |   |                               also COPYs in knowledge_agent/ and classifier/ source</w:t>
         <w:br/>
       </w:r>
       <w:r>
@@ -8829,7 +9487,11 @@
         <w:br/>
       </w:r>
       <w:r>
-        <w:t>|   |   |-- code_fixer.py               KB-hit path + tool-use loop fallback + InvalidRetryError guard</w:t>
+        <w:t>|   |   |-- code_fixer.py               tool-use loop + InvalidRetryError guard; KB-hit fast path</w:t>
+        <w:br/>
+      </w:r>
+      <w:r>
+        <w:t>|   |   |                               designed but NOT implemented (Section 11.5)</w:t>
         <w:br/>
       </w:r>
       <w:r>
@@ -8881,7 +9543,15 @@
         <w:br/>
       </w:r>
       <w:r>
-        <w:t>|       `-- retry_gate.py               logic-only; no model calls, no file edits, no git</w:t>
+        <w:t>|       |-- retry_gate.py               logic-only; no model calls, no file edits, no git</w:t>
+        <w:br/>
+      </w:r>
+      <w:r>
+        <w:t>|       |-- pattern_learner.py          writes Tier-1 KB entries after a confirmed fix (CI_PASSED)</w:t>
+        <w:br/>
+      </w:r>
+      <w:r>
+        <w:t>|       `-- retry_controller.py, cosmos_counter.py   legacy, unused (Section 11.5)</w:t>
         <w:br/>
       </w:r>
       <w:r>
@@ -8909,7 +9579,7 @@
         <w:br/>
       </w:r>
       <w:r>
-        <w:t>|   |-- test_code_fixer.py</w:t>
+        <w:t>|   |-- test_code_fixer.py              includes CodeFixer.run_retry_fix() coverage</w:t>
         <w:br/>
       </w:r>
       <w:r>
@@ -8917,7 +9587,7 @@
         <w:br/>
       </w:r>
       <w:r>
-        <w:t>|   `-- test_retry_gate.py</w:t>
+        <w:t>|   `-- test_retry_controller.py        tests the legacy retry_controller.py -- NOT RetryGate (Section 11.5)</w:t>
         <w:br/>
       </w:r>
       <w:r>
@@ -8946,7 +9616,7 @@
           <w:i w:val="0"/>
           <w:sz w:val="21"/>
         </w:rPr>
-        <w:t>This design document is derived from PLAN.md in the nexus-remediation-agent repository, which remains the canonical, continuously-updated build and deployment plan. Where this document and PLAN.md diverge after future changes, PLAN.md should be treated as authoritative and this document updated to match.</w:t>
+        <w:t>This design document is derived from PLAN.md in the nexus-remediation-agent repository, which remains the canonical, continuously-updated build and deployment plan; DEPLOYMENT_AAF.md is the canonical, continuously-updated deployment walkthrough. Where this document diverges from either after future changes, those two should be treated as authoritative and this document updated to match. Last synchronized against PLAN.md through its Section 4.9 (Azure Monitor telemetry, OBS-02).</w:t>
       </w:r>
     </w:p>
     <w:sectPr>

</xml_diff>